<commit_message>
Studienarchiv repariert: falsch zugeordnete PMIDs und Herkunftsangaben
Pruefung aller Archiveintraege gegen PubMed am 11.10.2026. Bei 25 Eintraegen
in 13 Hubs gehoerten deutscher Text und PMID zu verschiedenen Arbeiten - das
Modell hatte Ziffern der PMID verschrieben. Je nach Fall: auf die richtige
PMID umgehaengt (Journal, Jahr, Autor aus PubMed), als Dublette entfernt
(richtige Arbeit stand schon im Archiv) oder entfernt (keine passende Arbeit
auffindbar). Dazu Laender im Titel und zwei inhaltlich falsche
Zusammenfassungen korrigiert. Feed und Archiv-Downloads neu erzeugt.

Die Ursache ist in hub-scripts behoben (13b087d).

Co-Authored-By: Claude Opus 5.5 <noreply@anthropic.com>
</commit_message>
<xml_diff>
--- a/download/studien-archiv.docx
+++ b/download/studien-archiv.docx
@@ -5064,7 +5064,7 @@
           <w:color w:val="666666"/>
           <w:sz w:val="18"/>
         </w:rPr>
-        <w:t>Jiménez-Flores E et al.  ·  Nutrients  ·  20.09.2026  ·  PMID 42797057</w:t>
+        <w:t>Cameron C et al.  ·  Nutrients  ·  21.09.2026  ·  PMID 42797085</w:t>
       </w:r>
     </w:p>
     <w:p>
@@ -5104,7 +5104,7 @@
           <w:color w:val="5A7D3A"/>
           <w:sz w:val="18"/>
         </w:rPr>
-        <w:t>https://pubmed.ncbi.nlm.nih.gov/42797057/</w:t>
+        <w:t>https://pubmed.ncbi.nlm.nih.gov/42797085/</w:t>
       </w:r>
     </w:p>
     <w:p>
@@ -9394,7 +9394,7 @@
           <w:color w:val="666666"/>
           <w:sz w:val="18"/>
         </w:rPr>
-        <w:t>Evans C et al.  ·  Nutrients  ·  02.09.2026  ·  PMID 42739050</w:t>
+        <w:t>Henderson GV et al.  ·  Nutrients  ·  29.08.2026  ·  PMID 42739011</w:t>
       </w:r>
     </w:p>
     <w:p>
@@ -9434,7 +9434,7 @@
           <w:color w:val="5A7D3A"/>
           <w:sz w:val="18"/>
         </w:rPr>
-        <w:t>https://pubmed.ncbi.nlm.nih.gov/42739050/</w:t>
+        <w:t>https://pubmed.ncbi.nlm.nih.gov/42739011/</w:t>
       </w:r>
     </w:p>
     <w:p>
@@ -12886,7 +12886,7 @@
         <w:pStyle w:val="Heading2"/>
       </w:pPr>
       <w:r>
-        <w:t>Naturkontakt und Übergewicht bei Kindern: GRACE-Studie in Spanien und 5 Ländern</w:t>
+        <w:t>Naturkontakt und Übergewicht bei Kindern: Studienprotokoll aus der spanischen Kinder-Primärversorgung</w:t>
       </w:r>
     </w:p>
     <w:p>
@@ -12901,7 +12901,7 @@
     </w:p>
     <w:p>
       <w:r>
-        <w:t>GRACE-Studienprotokoll, prospektive Querschnittsuntersuchung über Geschlechtsdifferenzen in der Körperbildwahrnehmung bei krebs-induziertem Gewichtsverlust, später auch prospektive Prüfung: Naturkontakt bei Kindern (7–14 J.) und Adipositas-Assoziationen in Spanien und 5 weiteren Ländern.</w:t>
+        <w:t>Protokoll einer multizentrischen Querschnittstudie des spanischen Forschungsnetzes PAPenRed (Kinder-Primärversorgung) zum Zusammenhang zwischen Naturverbundenheit und Adipositas, Asthma, Entwicklungs-, psychischen und Schlafstörungen sowie Lebensqualität bei 7- bis 14-Jährigen.</w:t>
       </w:r>
     </w:p>
     <w:p>
@@ -12912,7 +12912,7 @@
         <w:t xml:space="preserve">Ergebnis: </w:t>
       </w:r>
       <w:r>
-        <w:t>Studienprotokoll für 600 Kinder (50 % Mädchen) über 12 Monate; primärer Endpunkt ist Unterschied in Körperbildskala-Scores zwischen Geschlechtern (3 Punkte als klinisch relevant). Dabei Erfassung von physischer Aktivität, Bildschirmzeit, psychischen und schulischen Faktoren.</w:t>
+        <w:t>Studienprotokoll, noch keine Ergebnisse. Erhebung über zwölf Monate (Juli 2025 bis Juni 2026) bei Vorsorgeuntersuchungen mit drei parallelen Fragebögen für Kind, Eltern und Kinderarzt.</w:t>
       </w:r>
     </w:p>
     <w:p>
@@ -12927,7 +12927,7 @@
         <w:rPr>
           <w:sz w:val="19"/>
         </w:rPr>
-        <w:t>Spanien und multinationale Kohörte, primärmedizinische Versorgung, Prävention im schulischen Kontext.</w:t>
+        <w:t>Spanien, pädiatrische Primärversorgung; noch keine Ergebnisse</w:t>
       </w:r>
     </w:p>
     <w:p>

</xml_diff>